<commit_message>
Add document cleanup functions to Step 4 (TOC, headers/footers, revision tables, definition flattening)
</commit_message>
<xml_diff>
--- a/input/Configuration_Management_Policy_POL-CM-2026-004.docx
+++ b/input/Configuration_Management_Policy_POL-CM-2026-004.docx
@@ -29,7 +29,7 @@
       </w:r>
       <w:proofErr w:type="gramEnd"/>
       <w:r>
-        <w:t xml:space="preserve"> | Classification: FOUO</w:t>
+        <w:t xml:space="preserve"> | </w:t>
       </w:r>
     </w:p>
     <w:p/>
@@ -53,6 +53,9 @@
       </w:pPr>
       <w:r>
         <w:t>This document establishes the configuration management requirements for all information systems and network devices operated by the organization. Configuration management ensures that systems remain in a known, secure state throughout their lifecycle.</w:t>
+      </w:r>
+      <w:r>
+        <w:t xml:space="preserve"> Blah Blah.</w:t>
       </w:r>
     </w:p>
     <w:p/>
@@ -204,10 +207,10 @@
         <w:tblLook w:val="04A0" w:firstRow="1" w:lastRow="0" w:firstColumn="1" w:lastColumn="0" w:noHBand="0" w:noVBand="1"/>
       </w:tblPr>
       <w:tblGrid>
-        <w:gridCol w:w="1269"/>
-        <w:gridCol w:w="1497"/>
-        <w:gridCol w:w="2462"/>
-        <w:gridCol w:w="1064"/>
+        <w:gridCol w:w="1434"/>
+        <w:gridCol w:w="1478"/>
+        <w:gridCol w:w="2322"/>
+        <w:gridCol w:w="1058"/>
         <w:gridCol w:w="1678"/>
         <w:gridCol w:w="1390"/>
       </w:tblGrid>
@@ -413,6 +416,13 @@
               </w:rPr>
               <w:t>CFG01.001</w:t>
             </w:r>
+            <w:r>
+              <w:rPr>
+                <w:sz w:val="20"/>
+                <w:szCs w:val="20"/>
+              </w:rPr>
+              <w:t xml:space="preserve"> – Table test!! </w:t>
+            </w:r>
           </w:p>
         </w:tc>
         <w:tc>
@@ -570,6 +580,29 @@
                 <w:szCs w:val="20"/>
               </w:rPr>
               <w:t>CFG01.002</w:t>
+            </w:r>
+            <w:r>
+              <w:rPr>
+                <w:sz w:val="20"/>
+                <w:szCs w:val="20"/>
+              </w:rPr>
+              <w:t>—</w:t>
+            </w:r>
+            <w:proofErr w:type="spellStart"/>
+            <w:r>
+              <w:rPr>
+                <w:sz w:val="20"/>
+                <w:szCs w:val="20"/>
+              </w:rPr>
+              <w:t>Tableeeee</w:t>
+            </w:r>
+            <w:proofErr w:type="spellEnd"/>
+            <w:r>
+              <w:rPr>
+                <w:sz w:val="20"/>
+                <w:szCs w:val="20"/>
+              </w:rPr>
+              <w:t xml:space="preserve"> TEST</w:t>
             </w:r>
           </w:p>
         </w:tc>
@@ -1418,6 +1451,7 @@
                 <w:sz w:val="20"/>
                 <w:szCs w:val="20"/>
               </w:rPr>
+              <w:lastRenderedPageBreak/>
               <w:t>CFG03.002</w:t>
             </w:r>
           </w:p>
@@ -1470,15 +1504,7 @@
                 <w:sz w:val="20"/>
                 <w:szCs w:val="20"/>
               </w:rPr>
-              <w:t xml:space="preserve">The organization shall deploy automated drift </w:t>
-            </w:r>
-            <w:r>
-              <w:rPr>
-                <w:sz w:val="20"/>
-                <w:szCs w:val="20"/>
-              </w:rPr>
-              <w:lastRenderedPageBreak/>
-              <w:t>detection that alerts when system configurations deviate from the approved baseline.</w:t>
+              <w:t>The organization shall deploy automated drift detection that alerts when system configurations deviate from the approved baseline.</w:t>
             </w:r>
           </w:p>
         </w:tc>
@@ -1504,7 +1530,6 @@
                 <w:sz w:val="20"/>
                 <w:szCs w:val="20"/>
               </w:rPr>
-              <w:lastRenderedPageBreak/>
               <w:t>CM-3(5)</w:t>
             </w:r>
           </w:p>
@@ -2535,6 +2560,7 @@
                 <w:sz w:val="20"/>
                 <w:szCs w:val="20"/>
               </w:rPr>
+              <w:lastRenderedPageBreak/>
               <w:t>Rollback Plan</w:t>
             </w:r>
           </w:p>
@@ -2589,7 +2615,6 @@
                 <w:sz w:val="20"/>
                 <w:szCs w:val="20"/>
               </w:rPr>
-              <w:lastRenderedPageBreak/>
               <w:t>Testing Results</w:t>
             </w:r>
           </w:p>
@@ -3628,6 +3653,48 @@
       </w:tr>
     </w:tbl>
     <w:p/>
+    <w:p>
+      <w:r>
+        <w:t>Document History:</w:t>
+      </w:r>
+    </w:p>
+    <w:p/>
+    <w:p>
+      <w:pPr>
+        <w:pStyle w:val="ListParagraph"/>
+        <w:numPr>
+          <w:ilvl w:val="0"/>
+          <w:numId w:val="2"/>
+        </w:numPr>
+      </w:pPr>
+      <w:r>
+        <w:t>Last updated yesterday</w:t>
+      </w:r>
+    </w:p>
+    <w:p>
+      <w:pPr>
+        <w:pStyle w:val="ListParagraph"/>
+        <w:numPr>
+          <w:ilvl w:val="0"/>
+          <w:numId w:val="2"/>
+        </w:numPr>
+      </w:pPr>
+      <w:r>
+        <w:t>Reviewed Tomorrow</w:t>
+      </w:r>
+    </w:p>
+    <w:p>
+      <w:pPr>
+        <w:pStyle w:val="ListParagraph"/>
+        <w:numPr>
+          <w:ilvl w:val="0"/>
+          <w:numId w:val="2"/>
+        </w:numPr>
+      </w:pPr>
+      <w:r>
+        <w:t>Due 01/01/1990</w:t>
+      </w:r>
+    </w:p>
     <w:sectPr>
       <w:headerReference w:type="default" r:id="rId8"/>
       <w:footerReference w:type="default" r:id="rId9"/>
@@ -3751,6 +3818,119 @@
 <file path=word/numbering.xml><?xml version="1.0" encoding="utf-8"?>
 <w:numbering xmlns:wpc="http://schemas.microsoft.com/office/word/2010/wordprocessingCanvas" xmlns:cx="http://schemas.microsoft.com/office/drawing/2014/chartex" xmlns:cx1="http://schemas.microsoft.com/office/drawing/2015/9/8/chartex" xmlns:cx2="http://schemas.microsoft.com/office/drawing/2015/10/21/chartex" xmlns:cx3="http://schemas.microsoft.com/office/drawing/2016/5/9/chartex" xmlns:cx4="http://schemas.microsoft.com/office/drawing/2016/5/10/chartex" xmlns:cx5="http://schemas.microsoft.com/office/drawing/2016/5/11/chartex" xmlns:cx6="http://schemas.microsoft.com/office/drawing/2016/5/12/chartex" xmlns:cx7="http://schemas.microsoft.com/office/drawing/2016/5/13/chartex" xmlns:cx8="http://schemas.microsoft.com/office/drawing/2016/5/14/chartex" xmlns:mc="http://schemas.openxmlformats.org/markup-compatibility/2006" xmlns:aink="http://schemas.microsoft.com/office/drawing/2016/ink" xmlns:am3d="http://schemas.microsoft.com/office/drawing/2017/model3d" xmlns:o="urn:schemas-microsoft-com:office:office" xmlns:oel="http://schemas.microsoft.com/office/2019/extlst" xmlns:r="http://schemas.openxmlformats.org/officeDocument/2006/relationships" xmlns:m="http://schemas.openxmlformats.org/officeDocument/2006/math" xmlns:v="urn:schemas-microsoft-com:vml" xmlns:wp14="http://schemas.microsoft.com/office/word/2010/wordprocessingDrawing" xmlns:wp="http://schemas.openxmlformats.org/drawingml/2006/wordprocessingDrawing" xmlns:w10="urn:schemas-microsoft-com:office:word" xmlns:w="http://schemas.openxmlformats.org/wordprocessingml/2006/main" xmlns:w14="http://schemas.microsoft.com/office/word/2010/wordml" xmlns:w15="http://schemas.microsoft.com/office/word/2012/wordml" xmlns:w16cex="http://schemas.microsoft.com/office/word/2018/wordml/cex" xmlns:w16cid="http://schemas.microsoft.com/office/word/2016/wordml/cid" xmlns:w16="http://schemas.microsoft.com/office/word/2018/wordml" xmlns:w16du="http://schemas.microsoft.com/office/word/2023/wordml/word16du" xmlns:w16sdtdh="http://schemas.microsoft.com/office/word/2020/wordml/sdtdatahash" xmlns:w16sdtfl="http://schemas.microsoft.com/office/word/2024/wordml/sdtformatlock" xmlns:w16se="http://schemas.microsoft.com/office/word/2015/wordml/symex" xmlns:wpg="http://schemas.microsoft.com/office/word/2010/wordprocessingGroup" xmlns:wpi="http://schemas.microsoft.com/office/word/2010/wordprocessingInk" xmlns:wne="http://schemas.microsoft.com/office/word/2006/wordml" xmlns:wps="http://schemas.microsoft.com/office/word/2010/wordprocessingShape" mc:Ignorable="w14 w15 w16se w16cid w16 w16cex w16sdtdh w16sdtfl w16du wp14">
   <w:abstractNum w:abstractNumId="0" w15:restartNumberingAfterBreak="0">
+    <w:nsid w:val="42C94A0C"/>
+    <w:multiLevelType w:val="hybridMultilevel"/>
+    <w:tmpl w:val="17F21426"/>
+    <w:lvl w:ilvl="0" w:tplc="607CEABE">
+      <w:start w:val="900"/>
+      <w:numFmt w:val="bullet"/>
+      <w:lvlText w:val="-"/>
+      <w:lvlJc w:val="left"/>
+      <w:pPr>
+        <w:ind w:left="720" w:hanging="360"/>
+      </w:pPr>
+      <w:rPr>
+        <w:rFonts w:ascii="Arial" w:eastAsia="Arial" w:hAnsi="Arial" w:cs="Arial" w:hint="default"/>
+      </w:rPr>
+    </w:lvl>
+    <w:lvl w:ilvl="1" w:tplc="04090003" w:tentative="1">
+      <w:start w:val="1"/>
+      <w:numFmt w:val="bullet"/>
+      <w:lvlText w:val="o"/>
+      <w:lvlJc w:val="left"/>
+      <w:pPr>
+        <w:ind w:left="1440" w:hanging="360"/>
+      </w:pPr>
+      <w:rPr>
+        <w:rFonts w:ascii="Courier New" w:hAnsi="Courier New" w:hint="default"/>
+      </w:rPr>
+    </w:lvl>
+    <w:lvl w:ilvl="2" w:tplc="04090005" w:tentative="1">
+      <w:start w:val="1"/>
+      <w:numFmt w:val="bullet"/>
+      <w:lvlText w:val=""/>
+      <w:lvlJc w:val="left"/>
+      <w:pPr>
+        <w:ind w:left="2160" w:hanging="360"/>
+      </w:pPr>
+      <w:rPr>
+        <w:rFonts w:ascii="Wingdings" w:hAnsi="Wingdings" w:hint="default"/>
+      </w:rPr>
+    </w:lvl>
+    <w:lvl w:ilvl="3" w:tplc="04090001" w:tentative="1">
+      <w:start w:val="1"/>
+      <w:numFmt w:val="bullet"/>
+      <w:lvlText w:val=""/>
+      <w:lvlJc w:val="left"/>
+      <w:pPr>
+        <w:ind w:left="2880" w:hanging="360"/>
+      </w:pPr>
+      <w:rPr>
+        <w:rFonts w:ascii="Symbol" w:hAnsi="Symbol" w:hint="default"/>
+      </w:rPr>
+    </w:lvl>
+    <w:lvl w:ilvl="4" w:tplc="04090003" w:tentative="1">
+      <w:start w:val="1"/>
+      <w:numFmt w:val="bullet"/>
+      <w:lvlText w:val="o"/>
+      <w:lvlJc w:val="left"/>
+      <w:pPr>
+        <w:ind w:left="3600" w:hanging="360"/>
+      </w:pPr>
+      <w:rPr>
+        <w:rFonts w:ascii="Courier New" w:hAnsi="Courier New" w:hint="default"/>
+      </w:rPr>
+    </w:lvl>
+    <w:lvl w:ilvl="5" w:tplc="04090005" w:tentative="1">
+      <w:start w:val="1"/>
+      <w:numFmt w:val="bullet"/>
+      <w:lvlText w:val=""/>
+      <w:lvlJc w:val="left"/>
+      <w:pPr>
+        <w:ind w:left="4320" w:hanging="360"/>
+      </w:pPr>
+      <w:rPr>
+        <w:rFonts w:ascii="Wingdings" w:hAnsi="Wingdings" w:hint="default"/>
+      </w:rPr>
+    </w:lvl>
+    <w:lvl w:ilvl="6" w:tplc="04090001" w:tentative="1">
+      <w:start w:val="1"/>
+      <w:numFmt w:val="bullet"/>
+      <w:lvlText w:val=""/>
+      <w:lvlJc w:val="left"/>
+      <w:pPr>
+        <w:ind w:left="5040" w:hanging="360"/>
+      </w:pPr>
+      <w:rPr>
+        <w:rFonts w:ascii="Symbol" w:hAnsi="Symbol" w:hint="default"/>
+      </w:rPr>
+    </w:lvl>
+    <w:lvl w:ilvl="7" w:tplc="04090003" w:tentative="1">
+      <w:start w:val="1"/>
+      <w:numFmt w:val="bullet"/>
+      <w:lvlText w:val="o"/>
+      <w:lvlJc w:val="left"/>
+      <w:pPr>
+        <w:ind w:left="5760" w:hanging="360"/>
+      </w:pPr>
+      <w:rPr>
+        <w:rFonts w:ascii="Courier New" w:hAnsi="Courier New" w:hint="default"/>
+      </w:rPr>
+    </w:lvl>
+    <w:lvl w:ilvl="8" w:tplc="04090005" w:tentative="1">
+      <w:start w:val="1"/>
+      <w:numFmt w:val="bullet"/>
+      <w:lvlText w:val=""/>
+      <w:lvlJc w:val="left"/>
+      <w:pPr>
+        <w:ind w:left="6480" w:hanging="360"/>
+      </w:pPr>
+      <w:rPr>
+        <w:rFonts w:ascii="Wingdings" w:hAnsi="Wingdings" w:hint="default"/>
+      </w:rPr>
+    </w:lvl>
+  </w:abstractNum>
+  <w:abstractNum w:abstractNumId="1" w15:restartNumberingAfterBreak="0">
     <w:nsid w:val="69FE0FFA"/>
     <w:multiLevelType w:val="hybridMultilevel"/>
     <w:tmpl w:val="3AE0F938"/>
@@ -3836,7 +4016,7 @@
       </w:pPr>
     </w:lvl>
   </w:abstractNum>
-  <w:abstractNum w:abstractNumId="1" w15:restartNumberingAfterBreak="0">
+  <w:abstractNum w:abstractNumId="2" w15:restartNumberingAfterBreak="0">
     <w:nsid w:val="6ED82223"/>
     <w:multiLevelType w:val="hybridMultilevel"/>
     <w:tmpl w:val="B1767548"/>
@@ -3891,10 +4071,13 @@
     </w:lvl>
   </w:abstractNum>
   <w:num w:numId="1" w16cid:durableId="1347753464">
-    <w:abstractNumId w:val="0"/>
+    <w:abstractNumId w:val="1"/>
     <w:lvlOverride w:ilvl="0">
       <w:startOverride w:val="1"/>
     </w:lvlOverride>
+  </w:num>
+  <w:num w:numId="2" w16cid:durableId="901135308">
+    <w:abstractNumId w:val="0"/>
   </w:num>
 </w:numbering>
 </file>

</xml_diff>